<commit_message>
Improve SRS and PT-PT documentation
</commit_message>
<xml_diff>
--- a/docs/docx/ATC_Full_User_Guide_PT-PT.docx
+++ b/docs/docx/ATC_Full_User_Guide_PT-PT.docx
@@ -11,18 +11,21 @@
       </w:r>
     </w:p>
     <w:p>
-      <w:r>
-        <w:t>﻿# Guia Completo de Utilizador do Advanced Trigonometry Calculator</w:t>
-      </w:r>
-    </w:p>
-    <w:p>
-      <w:r>
-        <w:t>Versao: ATC 2.1.7</w:t>
-      </w:r>
-    </w:p>
-    <w:p>
-      <w:r>
-        <w:t>Idioma: Portugues de Portugal</w:t>
+      <w:pPr>
+        <w:pStyle w:val="Heading1"/>
+      </w:pPr>
+      <w:r>
+        <w:t>Guia Completo de Utilizador do Advanced Trigonometry Calculator</w:t>
+      </w:r>
+    </w:p>
+    <w:p>
+      <w:r>
+        <w:t>Versão: ATC 2.1.7</w:t>
+      </w:r>
+    </w:p>
+    <w:p>
+      <w:r>
+        <w:t>Idioma: Português de Portugal</w:t>
       </w:r>
     </w:p>
     <w:p>
@@ -32,17 +35,17 @@
     </w:p>
     <w:p>
       <w:r>
-        <w:t>Este e o guia de utilizador expandido do Advanced Trigonometry Calculator</w:t>
-      </w:r>
-    </w:p>
-    <w:p>
-      <w:r>
-        <w:t>(ATC). Foi construido a partir do guia online existente, da documentacao 2.1.7</w:t>
-      </w:r>
-    </w:p>
-    <w:p>
-      <w:r>
-        <w:t>atual e da cobertura automatizada de regressao deste repositorio.</w:t>
+        <w:t>Este é o guia de utilizador expandido do Advanced Trigonometry Calculator</w:t>
+      </w:r>
+    </w:p>
+    <w:p>
+      <w:r>
+        <w:t>(ATC). Foi construído a partir do guia online existente, da documentação 2.1.7</w:t>
+      </w:r>
+    </w:p>
+    <w:p>
+      <w:r>
+        <w:t>atual e da cobertura automatizada de regressão deste repositório.</w:t>
       </w:r>
     </w:p>
     <w:p>
@@ -50,22 +53,22 @@
         <w:pStyle w:val="Heading2"/>
       </w:pPr>
       <w:r>
-        <w:t>1. O que e o ATC</w:t>
-      </w:r>
-    </w:p>
-    <w:p>
-      <w:r>
-        <w:t>O ATC e uma aplicacao matematica gratuita, open source e de linha de comandos</w:t>
-      </w:r>
-    </w:p>
-    <w:p>
-      <w:r>
-        <w:t>para Windows. Foi desenhada para trabalho matematico local rapido atraves de</w:t>
-      </w:r>
-    </w:p>
-    <w:p>
-      <w:r>
-        <w:t>comandos e expressoes textuais.</w:t>
+        <w:t>1. O que é o ATC</w:t>
+      </w:r>
+    </w:p>
+    <w:p>
+      <w:r>
+        <w:t>O ATC é uma aplicação matemática gratuita, open source e de linha de comandos</w:t>
+      </w:r>
+    </w:p>
+    <w:p>
+      <w:r>
+        <w:t>para Windows. Foi desenhada para trabalho matemático local rápido através de</w:t>
+      </w:r>
+    </w:p>
+    <w:p>
+      <w:r>
+        <w:t>comandos e expressões textuais.</w:t>
       </w:r>
     </w:p>
     <w:p>
@@ -78,7 +81,7 @@
         <w:pStyle w:val="ListBullet"/>
       </w:pPr>
       <w:r>
-        <w:t>calculos cientificos rapidos;</w:t>
+        <w:t>cálculos científicos rápidos;</w:t>
       </w:r>
     </w:p>
     <w:p>
@@ -110,7 +113,7 @@
         <w:pStyle w:val="ListBullet"/>
       </w:pPr>
       <w:r>
-        <w:t>estatistica e probabilidade;</w:t>
+        <w:t>estatística e probabilidade;</w:t>
       </w:r>
     </w:p>
     <w:p>
@@ -118,7 +121,7 @@
         <w:pStyle w:val="ListBullet"/>
       </w:pPr>
       <w:r>
-        <w:t>funcoes DSP;</w:t>
+        <w:t>funções DSP;</w:t>
       </w:r>
     </w:p>
     <w:p>
@@ -142,7 +145,7 @@
         <w:pStyle w:val="ListBullet"/>
       </w:pPr>
       <w:r>
-        <w:t>variaveis e expressoes reutilizaveis;</w:t>
+        <w:t>variáveis e expressões reutilizaveis;</w:t>
       </w:r>
     </w:p>
     <w:p>
@@ -150,7 +153,7 @@
         <w:pStyle w:val="ListBullet"/>
       </w:pPr>
       <w:r>
-        <w:t>modulos interativos guiados;</w:t>
+        <w:t>módulos interativos guiados;</w:t>
       </w:r>
     </w:p>
     <w:p>
@@ -166,12 +169,12 @@
         <w:pStyle w:val="Heading2"/>
       </w:pPr>
       <w:r>
-        <w:t>2. O que o ATC nao e</w:t>
-      </w:r>
-    </w:p>
-    <w:p>
-      <w:r>
-        <w:t>O ATC foca-se deliberadamente em computacao matematica pratica orientada por</w:t>
+        <w:t>2. O que o ATC não é</w:t>
+      </w:r>
+    </w:p>
+    <w:p>
+      <w:r>
+        <w:t>O ATC foca-se deliberadamente em computação matemática prática orientada por</w:t>
       </w:r>
     </w:p>
     <w:p>
@@ -184,7 +187,7 @@
         <w:pStyle w:val="ListBullet"/>
       </w:pPr>
       <w:r>
-        <w:t>O ATC nao e um CAS geral completo como Mathematica, Maple, SageMath ou</w:t>
+        <w:t>O ATC não é um CAS geral completo como Mathematica, Maple, SageMath ou</w:t>
       </w:r>
     </w:p>
     <w:p>
@@ -197,7 +200,7 @@
         <w:pStyle w:val="ListBullet"/>
       </w:pPr>
       <w:r>
-        <w:t>O ATC nao foi desenhado para provar teoremas matematicos arbitrarios.</w:t>
+        <w:t>O ATC não foi desenhado para provar teoremas matemáticos arbitrários.</w:t>
       </w:r>
     </w:p>
     <w:p>
@@ -205,7 +208,7 @@
         <w:pStyle w:val="ListBullet"/>
       </w:pPr>
       <w:r>
-        <w:t>O ATC nao substitui ferramentas profissionais de validacao especificas de</w:t>
+        <w:t>O ATC não substitui ferramentas profissionais de validação específicas de</w:t>
       </w:r>
     </w:p>
     <w:p>
@@ -218,17 +221,17 @@
         <w:pStyle w:val="ListBullet"/>
       </w:pPr>
       <w:r>
-        <w:t>O ATC foca-se em calculo numerico, fluxos por comandos, uso educativo,</w:t>
-      </w:r>
-    </w:p>
-    <w:p>
-      <w:r>
-        <w:t xml:space="preserve">  funcionalidades hibridas simbolicas/numericas implementadas e execucao local</w:t>
-      </w:r>
-    </w:p>
-    <w:p>
-      <w:r>
-        <w:t xml:space="preserve">  rapida.</w:t>
+        <w:t>O ATC foca-se em cálculo numérico, fluxos por comandos, uso educativo,</w:t>
+      </w:r>
+    </w:p>
+    <w:p>
+      <w:r>
+        <w:t xml:space="preserve">  funcionalidades hibridas simbólicas/numéricas implementadas e execução local</w:t>
+      </w:r>
+    </w:p>
+    <w:p>
+      <w:r>
+        <w:t xml:space="preserve">  rápida.</w:t>
       </w:r>
     </w:p>
     <w:p>
@@ -236,7 +239,7 @@
         <w:pStyle w:val="ListBullet"/>
       </w:pPr>
       <w:r>
-        <w:t>Existe comportamento simbolico apenas onde esta explicitamente suportado e</w:t>
+        <w:t>Existe comportamento simbólico apenas onde está explicitamente suportado e</w:t>
       </w:r>
     </w:p>
     <w:p>
@@ -254,22 +257,22 @@
     </w:p>
     <w:p>
       <w:r>
-        <w:t>O ATC e uma aplicacao matematica de linha de comandos para Windows, gratuita e</w:t>
-      </w:r>
-    </w:p>
-    <w:p>
-      <w:r>
-        <w:t>open-source. Avalia expressoes matematicas, comandos documentados e workflows</w:t>
-      </w:r>
-    </w:p>
-    <w:p>
-      <w:r>
-        <w:t>guiados. Deve ser entendido como uma calculadora local pratica, nao como um CAS</w:t>
-      </w:r>
-    </w:p>
-    <w:p>
-      <w:r>
-        <w:t>simbolico universal.</w:t>
+        <w:t>O ATC é uma aplicação matemática de linha de comandos para Windows, gratuita e</w:t>
+      </w:r>
+    </w:p>
+    <w:p>
+      <w:r>
+        <w:t>open-source. Avalia expressões matemáticas, comandos documentados e workflows</w:t>
+      </w:r>
+    </w:p>
+    <w:p>
+      <w:r>
+        <w:t>guiados. Deve ser entendido como uma calculadora local prática, não como um CAS</w:t>
+      </w:r>
+    </w:p>
+    <w:p>
+      <w:r>
+        <w:t>simbólico universal.</w:t>
       </w:r>
     </w:p>
     <w:p>
@@ -279,12 +282,12 @@
     </w:p>
     <w:p>
       <w:r>
-        <w:t>atraves do atalho/launcher instalado quando existir. O prompt aceita um comando</w:t>
-      </w:r>
-    </w:p>
-    <w:p>
-      <w:r>
-        <w:t>ou expressao por linha.</w:t>
+        <w:t>através do atalho/launcher instalado quando existir. O prompt aceita um comando</w:t>
+      </w:r>
+    </w:p>
+    <w:p>
+      <w:r>
+        <w:t>ou expressão por linha.</w:t>
       </w:r>
     </w:p>
     <w:p>
@@ -320,7 +323,7 @@
     </w:p>
     <w:p>
       <w:r>
-        <w:t>Regras basicas de leitura:</w:t>
+        <w:t>Regras básicas de leitura:</w:t>
       </w:r>
     </w:p>
     <w:p>
@@ -328,7 +331,7 @@
         <w:pStyle w:val="ListBullet"/>
       </w:pPr>
       <w:r>
-        <w:t>_ e usado pelo ATC como marcador de negativo em varias formas documentadas</w:t>
+        <w:t>_ e usado pelo ATC como marcador de negativo em várias formas documentadas</w:t>
       </w:r>
     </w:p>
     <w:p>
@@ -349,7 +352,7 @@
         <w:pStyle w:val="ListBullet"/>
       </w:pPr>
       <w:r>
-        <w:t>Uma expressao direta e avaliada de imediato, por exemplo 2+2.</w:t>
+        <w:t>Uma expressão direta e avaliada de imediato, por exemplo 2+2.</w:t>
       </w:r>
     </w:p>
     <w:p>
@@ -365,7 +368,7 @@
         <w:pStyle w:val="ListBullet"/>
       </w:pPr>
       <w:r>
-        <w:t>Um modulo guiado abre um workflow interativo, por exemplo `financial</w:t>
+        <w:t>Um módulo guiado abre um workflow interativo, por exemplo `financial</w:t>
       </w:r>
     </w:p>
     <w:p>
@@ -404,12 +407,12 @@
     </w:p>
     <w:p>
       <w:r>
-        <w:t>Quando um resultado e importante, confirmar primeiro o modo angular e o modo de</w:t>
-      </w:r>
-    </w:p>
-    <w:p>
-      <w:r>
-        <w:t>precisao.</w:t>
+        <w:t>Quando um resultado é importante, confirmar primeiro o modo angular e o modo de</w:t>
+      </w:r>
+    </w:p>
+    <w:p>
+      <w:r>
+        <w:t>precisão.</w:t>
       </w:r>
     </w:p>
     <w:p>
@@ -422,7 +425,7 @@
     </w:p>
     <w:p>
       <w:r>
-        <w:t>As expressoes sao escritas diretamente no prompt.</w:t>
+        <w:t>As expressões são escritas diretamente no prompt.</w:t>
       </w:r>
     </w:p>
     <w:p>
@@ -445,7 +448,7 @@
     </w:p>
     <w:p>
       <w:r>
-        <w:t>Outputs estaveis:</w:t>
+        <w:t>Outputs estáveis:</w:t>
       </w:r>
     </w:p>
     <w:p>
@@ -537,7 +540,7 @@
         <w:pStyle w:val="ListBullet"/>
       </w:pPr>
       <w:r>
-        <w:t>Tab completa comandos, funcoes matematicas, aliases e funcoes do</w:t>
+        <w:t>Tab completa comandos, funções matemáticas, aliases e funções do</w:t>
       </w:r>
     </w:p>
     <w:p>
@@ -550,7 +553,7 @@
         <w:pStyle w:val="ListBullet"/>
       </w:pPr>
       <w:r>
-        <w:t>Tab repetido alterna entre completamentos possiveis;</w:t>
+        <w:t>Tab repetido alterna entre completamentos possíveis;</w:t>
       </w:r>
     </w:p>
     <w:p>
@@ -558,7 +561,7 @@
         <w:pStyle w:val="ListBullet"/>
       </w:pPr>
       <w:r>
-        <w:t>Up e Down navegam no historico;</w:t>
+        <w:t>Up e Down navegam no histórico;</w:t>
       </w:r>
     </w:p>
     <w:p>
@@ -689,7 +692,7 @@
     </w:p>
     <w:p>
       <w:r>
-        <w:t>A definicao e aplicada apos reiniciar o ATC.</w:t>
+        <w:t>A definição e aplicada após reiniciar o ATC.</w:t>
       </w:r>
     </w:p>
     <w:p>
@@ -741,7 +744,7 @@
     </w:p>
     <w:p>
       <w:r>
-        <w:t>maxprec permite usar mais precisao numa expressao sem alterar o modo</w:t>
+        <w:t>maxprec permite usar mais precisão numa expressão sem alterar o modo</w:t>
       </w:r>
     </w:p>
     <w:p>
@@ -810,7 +813,7 @@
         <w:pStyle w:val="Heading2"/>
       </w:pPr>
       <w:r>
-        <w:t>9. Aritmetica</w:t>
+        <w:t>9. Aritmética</w:t>
       </w:r>
     </w:p>
     <w:p>
@@ -1066,7 +1069,7 @@
     </w:p>
     <w:p>
       <w:r>
-        <w:t>O modo angular influencia funcoes trigonometricas com argumentos complexos.</w:t>
+        <w:t>O modo angular influencia funções trigonométricas com argumentos complexos.</w:t>
       </w:r>
     </w:p>
     <w:p>
@@ -1074,7 +1077,7 @@
         <w:pStyle w:val="Heading2"/>
       </w:pPr>
       <w:r>
-        <w:t>14. Multiplicacao automatica</w:t>
+        <w:t>14. Multiplicacao automática</w:t>
       </w:r>
     </w:p>
     <w:p>
@@ -1107,7 +1110,7 @@
     </w:p>
     <w:p>
       <w:r>
-        <w:t>Com variaveis:</w:t>
+        <w:t>Com variáveis:</w:t>
       </w:r>
     </w:p>
     <w:p>
@@ -1151,7 +1154,7 @@
         <w:pStyle w:val="Heading2"/>
       </w:pPr>
       <w:r>
-        <w:t>15. Variaveis</w:t>
+        <w:t>15. Variáveis</w:t>
       </w:r>
     </w:p>
     <w:p>
@@ -1287,7 +1290,7 @@
         <w:pStyle w:val="Heading2"/>
       </w:pPr>
       <w:r>
-        <w:t>17. Estatistica e probabilidade</w:t>
+        <w:t>17. Estatística e probabilidade</w:t>
       </w:r>
     </w:p>
     <w:p>
@@ -1356,7 +1359,7 @@
     </w:p>
     <w:p>
       <w:r>
-        <w:t>Modulo guiado:</w:t>
+        <w:t>Módulo guiado:</w:t>
       </w:r>
     </w:p>
     <w:p>
@@ -1446,7 +1449,7 @@
     </w:p>
     <w:p>
       <w:r>
-        <w:t>Raizes para polinomio:</w:t>
+        <w:t>Raizes para polinómio:</w:t>
       </w:r>
     </w:p>
     <w:p>
@@ -1637,7 +1640,7 @@
         <w:pStyle w:val="Heading2"/>
       </w:pPr>
       <w:r>
-        <w:t>22. Estudo de funcoes</w:t>
+        <w:t>22. Estudo de funções</w:t>
       </w:r>
     </w:p>
     <w:p>
@@ -1704,7 +1707,7 @@
     </w:p>
     <w:p>
       <w:r>
-        <w:t>O grafico e renderizado na consola. A validacao visual completa continua a ser</w:t>
+        <w:t>O grafico e renderizado na consola. A validação visual completa continua a ser</w:t>
       </w:r>
     </w:p>
     <w:p>
@@ -1748,7 +1751,7 @@
     </w:p>
     <w:p>
       <w:r>
-        <w:t>Estes modulos pedem valores e opcoes ao utilizador.</w:t>
+        <w:t>Estes módulos pedem valores e opções ao utilizador.</w:t>
       </w:r>
     </w:p>
     <w:p>
@@ -1761,7 +1764,7 @@
     </w:p>
     <w:p>
       <w:r>
-        <w:t>Financas:</w:t>
+        <w:t>Finanças:</w:t>
       </w:r>
     </w:p>
     <w:p>
@@ -1797,7 +1800,7 @@
     </w:p>
     <w:p>
       <w:r>
-        <w:t>Fisica:</w:t>
+        <w:t>Física:</w:t>
       </w:r>
     </w:p>
     <w:p>
@@ -2010,7 +2013,7 @@
     </w:p>
     <w:p>
       <w:r>
-        <w:t>O ATC deve continuar apos uma linha invalida e reportar o erro dessa linha.</w:t>
+        <w:t>O ATC deve continuar após uma linha invalida e reportar o erro dessa linha.</w:t>
       </w:r>
     </w:p>
     <w:p>
@@ -2093,7 +2096,7 @@
     </w:p>
     <w:p>
       <w:r>
-        <w:t>em calculos maiores.</w:t>
+        <w:t>em cálculos maiores.</w:t>
       </w:r>
     </w:p>
     <w:p>
@@ -2106,12 +2109,12 @@
     </w:p>
     <w:p>
       <w:r>
-        <w:t>As funcoes do utilizador vivem na pasta User functions. O autocomplete pode</w:t>
-      </w:r>
-    </w:p>
-    <w:p>
-      <w:r>
-        <w:t>sugerir funcoes como atc_&lt;nome&gt;(.</w:t>
+        <w:t>As funções do utilizador vivem na pasta User functions. O autocomplete pode</w:t>
+      </w:r>
+    </w:p>
+    <w:p>
+      <w:r>
+        <w:t>sugerir funções como atc_&lt;nome&gt;(.</w:t>
       </w:r>
     </w:p>
     <w:p>
@@ -2302,7 +2305,7 @@
     </w:p>
     <w:p>
       <w:r>
-        <w:t>O cookbook dedicado esta disponivel em:</w:t>
+        <w:t>O cookbook dedicado esta disponível em:</w:t>
       </w:r>
     </w:p>
     <w:p>
@@ -2319,12 +2322,12 @@
     </w:p>
     <w:p>
       <w:r>
-        <w:t>Inclui workflows praticos para calculo cientifico, trigonometria, polinomios,</w:t>
-      </w:r>
-    </w:p>
-    <w:p>
-      <w:r>
-        <w:t>matrizes, estatistica, DSP, TXT processing, verbose resolution e modulos</w:t>
+        <w:t>Inclui workflows praticos para cálculo cientifico, trigonometria, polinómios,</w:t>
+      </w:r>
+    </w:p>
+    <w:p>
+      <w:r>
+        <w:t>matrizes, estatística, DSP, TXT processing, verbose resolution e módulos</w:t>
       </w:r>
     </w:p>
     <w:p>
@@ -2337,7 +2340,7 @@
         <w:pStyle w:val="Heading2"/>
       </w:pPr>
       <w:r>
-        <w:t>36. Perfis de utilizacao</w:t>
+        <w:t>36. Perfis de utilização</w:t>
       </w:r>
     </w:p>
     <w:p>
@@ -2367,7 +2370,7 @@
     </w:p>
     <w:p>
       <w:r>
-        <w:t>Educacao:</w:t>
+        <w:t>Educação:</w:t>
       </w:r>
     </w:p>
     <w:p>
@@ -2415,7 +2418,7 @@
     </w:p>
     <w:p>
       <w:r>
-        <w:t>Estatistica:</w:t>
+        <w:t>Estatística:</w:t>
       </w:r>
     </w:p>
     <w:p>
@@ -2440,7 +2443,7 @@
     </w:p>
     <w:p>
       <w:r>
-        <w:t>Financas:</w:t>
+        <w:t>Finanças:</w:t>
       </w:r>
     </w:p>
     <w:p>
@@ -2462,12 +2465,12 @@
         <w:pStyle w:val="Heading2"/>
       </w:pPr>
       <w:r>
-        <w:t>37. Boas praticas</w:t>
-      </w:r>
-    </w:p>
-    <w:p>
-      <w:r>
-        <w:t>O guia dedicado de boas praticas esta disponivel em:</w:t>
+        <w:t>37. Boas práticas</w:t>
+      </w:r>
+    </w:p>
+    <w:p>
+      <w:r>
+        <w:t>O guia dedicado de boas práticas esta disponível em:</w:t>
       </w:r>
     </w:p>
     <w:p>
@@ -2484,7 +2487,7 @@
     </w:p>
     <w:p>
       <w:r>
-        <w:t>Usar para workflows fiaveis: comecar por expressoes pequenas, confirmar modo</w:t>
+        <w:t>Usar para workflows fiáveis: começar por expressões pequenas, confirmar modo</w:t>
       </w:r>
     </w:p>
     <w:p>
@@ -2494,7 +2497,7 @@
     </w:p>
     <w:p>
       <w:r>
-        <w:t>reprodutiveis e evitar comportamento nao documentado.</w:t>
+        <w:t>reprodutíveis e evitar comportamento não documentado.</w:t>
       </w:r>
     </w:p>
     <w:p>
@@ -2507,7 +2510,7 @@
     </w:p>
     <w:p>
       <w:r>
-        <w:t>Se uma expressao falhar:</w:t>
+        <w:t>Se uma expressão falhar:</w:t>
       </w:r>
     </w:p>
     <w:p>
@@ -2547,7 +2550,7 @@
         <w:pStyle w:val="ListBullet"/>
       </w:pPr>
       <w:r>
-        <w:t>testar partes menores da expressao;</w:t>
+        <w:t>testar partes menores da expressão;</w:t>
       </w:r>
     </w:p>
     <w:p>
@@ -2571,7 +2574,7 @@
         <w:pStyle w:val="Heading2"/>
       </w:pPr>
       <w:r>
-        <w:t>39. Documentacao e testes</w:t>
+        <w:t>39. Documentação e testes</w:t>
       </w:r>
     </w:p>
     <w:p>
@@ -2604,7 +2607,7 @@
           <w:rFonts w:ascii="Consolas" w:hAnsi="Consolas"/>
           <w:sz w:val="18"/>
         </w:rPr>
-        <w:t>Summary: 359 passed, 0 failed</w:t>
+        <w:t>Summary: 374 passed, 0 failed</w:t>
       </w:r>
     </w:p>
     <w:p>

</xml_diff>